<commit_message>
feat: add ResetPasswordScreen component for password reset functionality
</commit_message>
<xml_diff>
--- a/backend/app/tests/reports/modules/test_proximity_monitor_documentation.docx
+++ b/backend/app/tests/reports/modules/test_proximity_monitor_documentation.docx
@@ -12,17 +12,17 @@
     </w:p>
     <w:p>
       <w:r>
-        <w:t>Generated at: 2026-08-04T06:59:06+00:00</w:t>
-      </w:r>
-    </w:p>
-    <w:p>
-      <w:r>
-        <w:t>Test session started: 2026-08-04T06:59:05+00:00</w:t>
-      </w:r>
-    </w:p>
-    <w:p>
-      <w:r>
-        <w:t>Pytest exit status: 0</w:t>
+        <w:t>Generated at: 2026-08-07T05:49:22+00:00</w:t>
+      </w:r>
+    </w:p>
+    <w:p>
+      <w:r>
+        <w:t>Test session started: 2026-08-07T05:49:18+00:00</w:t>
+      </w:r>
+    </w:p>
+    <w:p>
+      <w:r>
+        <w:t>Pytest exit status: 1</w:t>
       </w:r>
     </w:p>
     <w:p>
@@ -88,7 +88,7 @@
           </w:tcPr>
           <w:p>
             <w:r>
-              <w:t>2</w:t>
+              <w:t>1</w:t>
             </w:r>
           </w:p>
         </w:tc>
@@ -110,7 +110,7 @@
           </w:tcPr>
           <w:p>
             <w:r>
-              <w:t>2</w:t>
+              <w:t>0</w:t>
             </w:r>
           </w:p>
         </w:tc>
@@ -132,7 +132,7 @@
           </w:tcPr>
           <w:p>
             <w:r>
-              <w:t>0</w:t>
+              <w:t>1</w:t>
             </w:r>
           </w:p>
         </w:tc>
@@ -318,37 +318,37 @@
           </w:tcPr>
           <w:p>
             <w:r>
-              <w:t>test_proximity_alert_clears_when_drones_separate</w:t>
-            </w:r>
-          </w:p>
-        </w:tc>
-        <w:tc>
-          <w:tcPr>
-            <w:tcW w:w="2400" w:type="dxa"/>
-          </w:tcPr>
-          <w:p>
-            <w:r>
-              <w:t>Proximity alert clears when drones separate</w:t>
-            </w:r>
-          </w:p>
-        </w:tc>
-        <w:tc>
-          <w:tcPr>
-            <w:tcW w:w="2400" w:type="dxa"/>
-          </w:tcPr>
-          <w:p>
-            <w:r>
-              <w:t>Passed</w:t>
-            </w:r>
-          </w:p>
-        </w:tc>
-        <w:tc>
-          <w:tcPr>
-            <w:tcW w:w="2400" w:type="dxa"/>
-          </w:tcPr>
-          <w:p>
-            <w:r>
-              <w:t>0.038</w:t>
+              <w:t>test_proximity_alert_requires_manual_control_below_250m</w:t>
+            </w:r>
+          </w:p>
+        </w:tc>
+        <w:tc>
+          <w:tcPr>
+            <w:tcW w:w="2400" w:type="dxa"/>
+          </w:tcPr>
+          <w:p>
+            <w:r>
+              <w:t>Proximity alert requires manual control below 250m</w:t>
+            </w:r>
+          </w:p>
+        </w:tc>
+        <w:tc>
+          <w:tcPr>
+            <w:tcW w:w="2400" w:type="dxa"/>
+          </w:tcPr>
+          <w:p>
+            <w:r>
+              <w:t>Failed</w:t>
+            </w:r>
+          </w:p>
+        </w:tc>
+        <w:tc>
+          <w:tcPr>
+            <w:tcW w:w="2400" w:type="dxa"/>
+          </w:tcPr>
+          <w:p>
+            <w:r>
+              <w:t>0.044</w:t>
             </w:r>
           </w:p>
         </w:tc>
@@ -368,79 +368,7 @@
           </w:tcPr>
           <w:p>
             <w:r>
-              <w:t>-</w:t>
-            </w:r>
-          </w:p>
-        </w:tc>
-      </w:tr>
-      <w:tr>
-        <w:tc>
-          <w:tcPr>
-            <w:tcW w:w="2400" w:type="dxa"/>
-          </w:tcPr>
-          <w:p>
-            <w:r>
-              <w:t>2</w:t>
-            </w:r>
-          </w:p>
-        </w:tc>
-        <w:tc>
-          <w:tcPr>
-            <w:tcW w:w="2400" w:type="dxa"/>
-          </w:tcPr>
-          <w:p>
-            <w:r>
-              <w:t>test_proximity_alert_requires_manual_control_below_250m</w:t>
-            </w:r>
-          </w:p>
-        </w:tc>
-        <w:tc>
-          <w:tcPr>
-            <w:tcW w:w="2400" w:type="dxa"/>
-          </w:tcPr>
-          <w:p>
-            <w:r>
-              <w:t>Proximity alert requires manual control below 250m</w:t>
-            </w:r>
-          </w:p>
-        </w:tc>
-        <w:tc>
-          <w:tcPr>
-            <w:tcW w:w="2400" w:type="dxa"/>
-          </w:tcPr>
-          <w:p>
-            <w:r>
-              <w:t>Passed</w:t>
-            </w:r>
-          </w:p>
-        </w:tc>
-        <w:tc>
-          <w:tcPr>
-            <w:tcW w:w="2400" w:type="dxa"/>
-          </w:tcPr>
-          <w:p>
-            <w:r>
-              <w:t>0.213</w:t>
-            </w:r>
-          </w:p>
-        </w:tc>
-        <w:tc>
-          <w:tcPr>
-            <w:tcW w:w="2400" w:type="dxa"/>
-          </w:tcPr>
-          <w:p>
-            <w:r>
-              <w:t>asyncio</w:t>
-            </w:r>
-          </w:p>
-        </w:tc>
-        <w:tc>
-          <w:tcPr>
-            <w:tcW w:w="2400" w:type="dxa"/>
-          </w:tcPr>
-          <w:p>
-            <w:r>
-              <w:t>-</w:t>
+              <w:t>async def test_proximity_alert_requires_manual_control_below_250m(): |         state = StateManager() |         state.init_drone(1, "ALPHA") |         state.init_drone(2, "BRAVO") |         listener = AsyncMock() |         state.subscribe(listener) |         await state.update(1, {"lat": 12.9716, "lon": 77.5946}) |         await state.update(2, {"lat": 12.9724, "lon": 77.5946}) |         left = state.get(1) |         right = state.get(2) | &gt;       assert left["proximity_alert"] is True | E       assert False is True</w:t>
             </w:r>
           </w:p>
         </w:tc>

</xml_diff>

<commit_message>
Refactor tests and enhance geofence validation
- Updated import path for `mavlink_manager` in `test_fleet_assign_api.py`.
- Added throwaway mission creation in `test_flight_missions_api.py` to ensure missions land in "planning" status for PATCH requests.
- Modified waypoint coordinates in `test_mission_deconfliction.py` for better test coverage.
- Enhanced geofence validation in `geofence.py` to reject degenerate polygons with zero area.
- Introduced comprehensive unit tests for `com_bridge.py`, covering serial device management, TCP communication, and HTTP endpoint handling.
</commit_message>
<xml_diff>
--- a/backend/app/tests/reports/modules/test_proximity_monitor_documentation.docx
+++ b/backend/app/tests/reports/modules/test_proximity_monitor_documentation.docx
@@ -12,12 +12,12 @@
     </w:p>
     <w:p>
       <w:r>
-        <w:t>Generated at: 2026-08-07T05:49:22+00:00</w:t>
-      </w:r>
-    </w:p>
-    <w:p>
-      <w:r>
-        <w:t>Test session started: 2026-08-07T05:49:18+00:00</w:t>
+        <w:t>Generated at: 2026-08-10T07:00:48+00:00</w:t>
+      </w:r>
+    </w:p>
+    <w:p>
+      <w:r>
+        <w:t>Test session started: 2026-08-10T06:57:10+00:00</w:t>
       </w:r>
     </w:p>
     <w:p>
@@ -88,29 +88,29 @@
           </w:tcPr>
           <w:p>
             <w:r>
+              <w:t>2</w:t>
+            </w:r>
+          </w:p>
+        </w:tc>
+      </w:tr>
+      <w:tr>
+        <w:tc>
+          <w:tcPr>
+            <w:tcW w:w="2400" w:type="dxa"/>
+          </w:tcPr>
+          <w:p>
+            <w:r>
+              <w:t>Passed</w:t>
+            </w:r>
+          </w:p>
+        </w:tc>
+        <w:tc>
+          <w:tcPr>
+            <w:tcW w:w="2400" w:type="dxa"/>
+          </w:tcPr>
+          <w:p>
+            <w:r>
               <w:t>1</w:t>
-            </w:r>
-          </w:p>
-        </w:tc>
-      </w:tr>
-      <w:tr>
-        <w:tc>
-          <w:tcPr>
-            <w:tcW w:w="2400" w:type="dxa"/>
-          </w:tcPr>
-          <w:p>
-            <w:r>
-              <w:t>Passed</w:t>
-            </w:r>
-          </w:p>
-        </w:tc>
-        <w:tc>
-          <w:tcPr>
-            <w:tcW w:w="2400" w:type="dxa"/>
-          </w:tcPr>
-          <w:p>
-            <w:r>
-              <w:t>0</w:t>
             </w:r>
           </w:p>
         </w:tc>
@@ -200,7 +200,7 @@
     </w:p>
     <w:p>
       <w:r>
-        <w:t>Source file: C:\Users\Chandrasekhar\Downloads\DroneArjuna_final\DroneArjuna\backend\app\tests\test_proximity_monitor.py</w:t>
+        <w:t>Source file: /app/app/tests/test_proximity_monitor.py</w:t>
       </w:r>
     </w:p>
     <w:tbl>
@@ -318,6 +318,78 @@
           </w:tcPr>
           <w:p>
             <w:r>
+              <w:t>test_proximity_alert_clears_when_drones_separate</w:t>
+            </w:r>
+          </w:p>
+        </w:tc>
+        <w:tc>
+          <w:tcPr>
+            <w:tcW w:w="2400" w:type="dxa"/>
+          </w:tcPr>
+          <w:p>
+            <w:r>
+              <w:t>Proximity alert clears when drones separate</w:t>
+            </w:r>
+          </w:p>
+        </w:tc>
+        <w:tc>
+          <w:tcPr>
+            <w:tcW w:w="2400" w:type="dxa"/>
+          </w:tcPr>
+          <w:p>
+            <w:r>
+              <w:t>Passed</w:t>
+            </w:r>
+          </w:p>
+        </w:tc>
+        <w:tc>
+          <w:tcPr>
+            <w:tcW w:w="2400" w:type="dxa"/>
+          </w:tcPr>
+          <w:p>
+            <w:r>
+              <w:t>0.019</w:t>
+            </w:r>
+          </w:p>
+        </w:tc>
+        <w:tc>
+          <w:tcPr>
+            <w:tcW w:w="2400" w:type="dxa"/>
+          </w:tcPr>
+          <w:p>
+            <w:r>
+              <w:t>asyncio</w:t>
+            </w:r>
+          </w:p>
+        </w:tc>
+        <w:tc>
+          <w:tcPr>
+            <w:tcW w:w="2400" w:type="dxa"/>
+          </w:tcPr>
+          <w:p>
+            <w:r>
+              <w:t>-</w:t>
+            </w:r>
+          </w:p>
+        </w:tc>
+      </w:tr>
+      <w:tr>
+        <w:tc>
+          <w:tcPr>
+            <w:tcW w:w="2400" w:type="dxa"/>
+          </w:tcPr>
+          <w:p>
+            <w:r>
+              <w:t>2</w:t>
+            </w:r>
+          </w:p>
+        </w:tc>
+        <w:tc>
+          <w:tcPr>
+            <w:tcW w:w="2400" w:type="dxa"/>
+          </w:tcPr>
+          <w:p>
+            <w:r>
               <w:t>test_proximity_alert_requires_manual_control_below_250m</w:t>
             </w:r>
           </w:p>
@@ -348,7 +420,7 @@
           </w:tcPr>
           <w:p>
             <w:r>
-              <w:t>0.044</w:t>
+              <w:t>0.024</w:t>
             </w:r>
           </w:p>
         </w:tc>

</xml_diff>